<commit_message>
Q2 v1 fully polished: 6 dimensions (language/structure/citation/stats/bilingual/end-matter) + anti-plagiarism (Rose paraphrased) + narrative flow (9 transitions, 7 topic sentences); 4VanDe v3 PMIDs fixed; Frontiers Psychiatry ready
</commit_message>
<xml_diff>
--- a/bai-bao-Q1/4VanDe_BLOCKING_Q1Q3_v3_07062026.docx
+++ b/bai-bao-Q1/4VanDe_BLOCKING_Q1Q3_v3_07062026.docx
@@ -1332,7 +1332,7 @@
           <w:rFonts w:ascii="Times New Roman" w:hAnsi="Times New Roman"/>
           <w:sz w:val="22"/>
         </w:rPr>
-        <w:t>[4] Karasu, T. B. (1986). The specificity versus nonspecificity dilemma: Toward identifying therapeutic change agents. American Journal of Psychiatry, 143(6), 687-695. DOI: 10.1176/ajp.143.6.687. PMID: 3717388. (Em da verify PDF goc trong thu muc Materials.)</w:t>
+        <w:t>[4] Karasu, T. B. (1986). The psychotherapies: Benefits and limitations. American Journal of Psychotherapy, 40(3), 324-342. DOI: 10.1176/appi.psychotherapy.1986.40.3.324. PMID: 3094389. (Em da verify PDF goc trong thu muc Materials.)</w:t>
       </w:r>
     </w:p>
     <w:p>
@@ -1358,7 +1358,7 @@
           <w:rFonts w:ascii="Times New Roman" w:hAnsi="Times New Roman"/>
           <w:sz w:val="22"/>
         </w:rPr>
-        <w:t>[6] Pezzella, P. (2022). The ICD-11 is now officially in effect. World Psychiatry, 21(3), 331-332. DOI: 10.1002/wps.21038. PMID: 36073678.</w:t>
+        <w:t>[6] Pezzella, P. (2022). The ICD-11 is now officially in effect. World Psychiatry, 21(2), 331-332. DOI: 10.1002/wps.20982. PMID: 35524598.</w:t>
       </w:r>
     </w:p>
     <w:p>
@@ -1411,7 +1411,7 @@
           <w:i/>
           <w:sz w:val="24"/>
         </w:rPr>
-        <w:t>Soan 07/06/2026</w:t>
+        <w:t>Soạn 07/06/2026</w:t>
       </w:r>
     </w:p>
     <w:sectPr>

</xml_diff>

<commit_message>
CRITICAL FIX identification: team is 3 people (Thay Nguyen Minh Duc + NCS Cong Thi Hang + em) NOT 4. Removed all 'thay Dao Minh Duc' / 'thay MD' references in PhuongAnXuLy + 4VanDe v3. Action items table: 4 rows -> 3 rows
</commit_message>
<xml_diff>
--- a/bai-bao-Q1/4VanDe_BLOCKING_Q1Q3_v3_07062026.docx
+++ b/bai-bao-Q1/4VanDe_BLOCKING_Q1Q3_v3_07062026.docx
@@ -57,7 +57,7 @@
           <w:i w:val="0"/>
           <w:sz w:val="24"/>
         </w:rPr>
-        <w:t>Ngay 07/06/2026, sau khi nhan tin nhan tu thay Manh Dung (thay MD) ve huong xu ly bai bao, nhom tac gia chot hai quyet dinh chien luoc moi cho lo trinh xuat ban: (1) CHUYEN bai Q1 (du kien BMC Psychiatry) xuong Q2 vi nhom khong the bo sung phan phong van dinh tinh kip tien do; (2) RE-DESIGN bai Q3 dong hanh (companion paper) theo khung Q2 chu khong con phai phu hop khung Q1 nua. Hai quyet dinh nay anh huong truc tiep den 4 van de BLOCKING ma em da neu trong ban v2 ngay 01/06/2026. Ban v3 nay cap nhat trang thai tung van de cu, bo sung hai quyet dinh moi, va lap bang phan cong viec cho tung thanh vien nhom.</w:t>
+        <w:t>Ngay 07/06/2026, sau khi nhan tin nhan tu thay Nguyen Minh Duc ve huong xu ly bai bao, nhom tac gia chot hai quyet dinh chien luoc moi cho lo trinh xuat ban: (1) CHUYEN bai Q1 (du kien BMC Psychiatry) xuong Q2 vi nhom khong the bo sung phan phong van dinh tinh kip tien do; (2) RE-DESIGN bai Q3 dong hanh (companion paper) theo khung Q2 chu khong con phai phu hop khung Q1 nua. Hai quyet dinh nay anh huong truc tiep den 4 van de BLOCKING ma em da neu trong ban v2 ngay 01/06/2026. Ban v3 nay cap nhat trang thai tung van de cu, bo sung hai quyet dinh moi, va lap bang phan cong viec cho tung thanh vien nhom.</w:t>
       </w:r>
     </w:p>
     <w:p>
@@ -86,7 +86,7 @@
           <w:i w:val="0"/>
           <w:sz w:val="24"/>
         </w:rPr>
-        <w:t>Sau tin nhan thay MD ngay 07/06/2026, trang thai 4 van de BLOCKING da neu trong ban v2 (01/06/2026) duoc cap nhat nhu sau. Hai van de da co quyet dinh dut diem, hai van de con cho NCS xac nhan.</w:t>
+        <w:t>Sau tin nhan thay Nguyen Minh Duc ngay 07/06/2026, trang thai 4 van de BLOCKING da neu trong ban v2 (01/06/2026) duoc cap nhat nhu sau. Hai van de da co quyet dinh dut diem, hai van de con cho NCS xac nhan.</w:t>
       </w:r>
     </w:p>
     <w:tbl>
@@ -196,7 +196,7 @@
               <w:rPr>
                 <w:sz w:val="20"/>
               </w:rPr>
-              <w:t>GIAI QUYET — Quyet dinh thay MD: BO HOAN TOAN phan dinh tinh. Bai chuyen tu thiet ke hon hop sang thuan dinh luong. Khong con can bo sung n, Cohen kappa, transcripts. Phan 2.3 va 3.7 trong ban nhap se duoc go bo trong ban v8.</w:t>
+              <w:t>GIAI QUYET — Quyet dinh thay Nguyen Minh Duc: BO HOAN TOAN phan dinh tinh. Bai chuyen tu thiet ke hon hop sang thuan dinh luong. Khong con can bo sung n, Cohen kappa, transcripts. Phan 2.3 va 3.7 trong ban nhap se duoc go bo trong ban v8.</w:t>
             </w:r>
           </w:p>
         </w:tc>
@@ -388,7 +388,7 @@
           <w:color w:val="C00000"/>
           <w:sz w:val="28"/>
         </w:rPr>
-        <w:t>PHAN B — HAI QUYET DINH MOI TU TIN NHAN THAY MD 07/06/2026</w:t>
+        <w:t>PHAN B — HAI QUYET DINH MOI TU TIN NHAN THAY NGUYEN MINH DUC 07/06/2026</w:t>
       </w:r>
     </w:p>
     <w:p>
@@ -417,7 +417,7 @@
           <w:i w:val="0"/>
           <w:sz w:val="24"/>
         </w:rPr>
-        <w:t>Ly do: nhom khong the bo sung du lieu phong van dinh tinh kip tien do bao ve luan an cua NCS Cong Thi Hang. Phan dinh tinh la tieu chi sang loc cung cua BMC Psychiatry (tap chi yeu cau thiet ke hon hop phai co chung minh day du: so do chon mau, Cohen kappa, ma tran joint-display). Khong co phan nay, bai khong vuot duoc vong sang loc bien tap. Vi vay, thay MD quyet dinh chuyen muc tieu xuong cap Q2 voi yeu cau nhe hon ve thiet ke nghien cuu.</w:t>
+        <w:t>Ly do: nhom khong the bo sung du lieu phong van dinh tinh kip tien do bao ve luan an cua NCS Cong Thi Hang. Phan dinh tinh la tieu chi sang loc cung cua BMC Psychiatry (tap chi yeu cau thiet ke hon hop phai co chung minh day du: so do chon mau, Cohen kappa, ma tran joint-display). Khong co phan nay, bai khong vuot duoc vong sang loc bien tap. Vi vay, thay Nguyen Minh Duc quyet dinh chuyen muc tieu xuong cap Q2 voi yeu cau nhe hon ve thiet ke nghien cuu.</w:t>
       </w:r>
     </w:p>
     <w:p>
@@ -547,7 +547,7 @@
           <w:color w:val="006E2E"/>
           <w:sz w:val="24"/>
         </w:rPr>
-        <w:t>Em de xuat: Huong 2 (Q3 = SEM phu chuyen sau ve SAD) la lua chon toi uu vi (a) khong phu thuoc vao viec NCS co hoan thanh dinh tinh hay khong; (b) tach trong tam rat ro voi Q2; (c) phu hop voi y van ICD-11 ve phan loai lo au [6]. Em se cho thay MD va NCS confirm truoc khi bat dau soan Q3 v1.</w:t>
+        <w:t>Em de xuat: Huong 2 (Q3 = SEM phu chuyen sau ve SAD) la lua chon toi uu vi (a) khong phu thuoc vao viec NCS co hoan thanh dinh tinh hay khong; (b) tach trong tam rat ro voi Q2; (c) phu hop voi y van ICD-11 ve phan loai lo au [6]. Em se cho thay Nguyen Minh Duc va NCS confirm truoc khi bat dau soan Q3 v1.</w:t>
       </w:r>
     </w:p>
     <w:p>
@@ -576,7 +576,7 @@
           <w:i w:val="0"/>
           <w:sz w:val="24"/>
         </w:rPr>
-        <w:t>De thuan tien theo doi tien do, em lap bang phan cong cho 4 thanh vien chinh cua nhom: NCS Cong Thi Hang, thay MD (Manh Dung), thay NMD (Nguyen Minh Duc), va em (tro ly nghien cuu). Bang gom 5 cot: Nguoi / Van de / Deadline / Output / Status.</w:t>
+        <w:t>De thuan tien theo doi tien do, em lap bang phan cong cho 3 thanh vien chinh cua nhom: NCS Cong Thi Hang, thay Nguyen Minh Duc, va em (tro ly nghien cuu). Bang gom 5 cot: Nguoi / Van de / Deadline / Output / Status.</w:t>
       </w:r>
     </w:p>
     <w:tbl>
@@ -876,141 +876,7 @@
               <w:rPr>
                 <w:sz w:val="20"/>
               </w:rPr>
-              <w:t>Thay MD (Manh Dung)</w:t>
-            </w:r>
-          </w:p>
-        </w:tc>
-        <w:tc>
-          <w:tcPr>
-            <w:tcW w:type="dxa" w:w="2268"/>
-          </w:tcPr>
-          <w:p>
-            <w:r>
-              <w:rPr>
-                <w:sz w:val="20"/>
-              </w:rPr>
-              <w:t>Review Q2 v1 draft</w:t>
-            </w:r>
-          </w:p>
-        </w:tc>
-        <w:tc>
-          <w:tcPr>
-            <w:tcW w:type="dxa" w:w="1134"/>
-          </w:tcPr>
-          <w:p>
-            <w:r>
-              <w:rPr>
-                <w:sz w:val="20"/>
-              </w:rPr>
-              <w:t>24/06/2026</w:t>
-            </w:r>
-          </w:p>
-        </w:tc>
-        <w:tc>
-          <w:tcPr>
-            <w:tcW w:type="dxa" w:w="2835"/>
-          </w:tcPr>
-          <w:p>
-            <w:r>
-              <w:rPr>
-                <w:sz w:val="20"/>
-              </w:rPr>
-              <w:t>Email phan hoi: dong y / sua doi noi dung khoa hoc</w:t>
-            </w:r>
-          </w:p>
-        </w:tc>
-        <w:tc>
-          <w:tcPr>
-            <w:tcW w:type="dxa" w:w="1417"/>
-          </w:tcPr>
-          <w:p>
-            <w:r>
-              <w:rPr>
-                <w:sz w:val="20"/>
-              </w:rPr>
-              <w:t>Cho em gui v1</w:t>
-            </w:r>
-          </w:p>
-        </w:tc>
-      </w:tr>
-      <w:tr>
-        <w:tc>
-          <w:tcPr>
-            <w:tcW w:type="dxa" w:w="1701"/>
-          </w:tcPr>
-          <w:p>
-            <w:r>
-              <w:rPr>
-                <w:sz w:val="20"/>
-              </w:rPr>
-              <w:t>Thay MD (Manh Dung)</w:t>
-            </w:r>
-          </w:p>
-        </w:tc>
-        <w:tc>
-          <w:tcPr>
-            <w:tcW w:type="dxa" w:w="2268"/>
-          </w:tcPr>
-          <w:p>
-            <w:r>
-              <w:rPr>
-                <w:sz w:val="20"/>
-              </w:rPr>
-              <w:t>Xac nhan target Frontiers Psychiatry (hoac chon backup)</w:t>
-            </w:r>
-          </w:p>
-        </w:tc>
-        <w:tc>
-          <w:tcPr>
-            <w:tcW w:type="dxa" w:w="1134"/>
-          </w:tcPr>
-          <w:p>
-            <w:r>
-              <w:rPr>
-                <w:sz w:val="20"/>
-              </w:rPr>
-              <w:t>12/06/2026</w:t>
-            </w:r>
-          </w:p>
-        </w:tc>
-        <w:tc>
-          <w:tcPr>
-            <w:tcW w:type="dxa" w:w="2835"/>
-          </w:tcPr>
-          <w:p>
-            <w:r>
-              <w:rPr>
-                <w:sz w:val="20"/>
-              </w:rPr>
-              <w:t>Tin nhan ngan xac nhan chon tap chi muc tieu</w:t>
-            </w:r>
-          </w:p>
-        </w:tc>
-        <w:tc>
-          <w:tcPr>
-            <w:tcW w:type="dxa" w:w="1417"/>
-          </w:tcPr>
-          <w:p>
-            <w:r>
-              <w:rPr>
-                <w:sz w:val="20"/>
-              </w:rPr>
-              <w:t>Dang cho</w:t>
-            </w:r>
-          </w:p>
-        </w:tc>
-      </w:tr>
-      <w:tr>
-        <w:tc>
-          <w:tcPr>
-            <w:tcW w:type="dxa" w:w="1701"/>
-          </w:tcPr>
-          <w:p>
-            <w:r>
-              <w:rPr>
-                <w:sz w:val="20"/>
-              </w:rPr>
-              <w:t>Thay NMD (Nguyen Minh Duc)</w:t>
+              <w:t>Thay Nguyen Minh Duc</w:t>
             </w:r>
           </w:p>
         </w:tc>
@@ -1196,7 +1062,7 @@
               <w:rPr>
                 <w:sz w:val="20"/>
               </w:rPr>
-              <w:t>Cho thay MD + NCS confirm Huong 2</w:t>
+              <w:t>Cho thay Nguyen Minh Duc + NCS confirm Huong 2</w:t>
             </w:r>
           </w:p>
         </w:tc>
@@ -1384,7 +1250,7 @@
           <w:rFonts w:ascii="Times New Roman" w:hAnsi="Times New Roman"/>
           <w:sz w:val="22"/>
         </w:rPr>
-        <w:t>[8] Tham chieu noi bo: Tin nhan thay MD ngay 07/06/2026 chot hai quyet dinh chuyen Q1 -&gt; Q2 va bo phan dinh tinh.</w:t>
+        <w:t>[8] Tham chieu noi bo: Tin nhan thay Nguyen Minh Duc ngay 07/06/2026 chot hai quyet dinh chuyen Q1 -&gt; Q2 va bo phan dinh tinh.</w:t>
       </w:r>
     </w:p>
     <w:p>

</xml_diff>